<commit_message>
Switch packs to 11/22/33 and Kandi category to Beads; update rules, templates and workbook
Co-Authored-By: Claude Opus 5.5 <noreply@anthropic.com>
</commit_message>
<xml_diff>
--- a/Neon Retro Rave Sprout Bundle | Festival Hair Clip Set.docx
+++ b/Neon Retro Rave Sprout Bundle | Festival Hair Clip Set.docx
@@ -360,7 +360,7 @@
           <w:sz w:val="21"/>
           <w:szCs w:val="21"/>
         </w:rPr>
-        <w:t xml:space="preserve">Shop a neon retro arcade rave sprout bundle. Assorted 3D-printed festival hair clips with colorful pixel-inspired designs in 10, 20 or 30 packs.</w:t>
+        <w:t xml:space="preserve">Shop a neon retro arcade rave sprout bundle. Assorted 3D-printed festival hair clips with colorful pixel-inspired designs in 11, 22 or 33 packs.</w:t>
       </w:r>
     </w:p>
     <w:p>
@@ -414,7 +414,7 @@
           <w:sz w:val="21"/>
           <w:szCs w:val="21"/>
         </w:rPr>
-        <w:t xml:space="preserve">Level up your whole crew's festival accessories with this colorful, arcade-inspired Rave Sprout bundle! Each pack mixes vibrant neon colors, retro pixel-style graphics, and bold geometric details, so you get a variety of 3D-printed hair clips that bring playful energy to any rave outfit. Each lightweight PLA charm sits on a spring attached to a metal alligator clip. Perfect for sharing with friends, trading at your next show, or gifting to the EDM lover in your life. Available in 10, 20 or 30 packs with bonus sprouts included.</w:t>
+        <w:t xml:space="preserve">Level up your whole crew's festival accessories with this colorful, arcade-inspired Rave Sprout bundle! Each pack mixes vibrant neon colors, retro pixel-style graphics, and bold geometric details, so you get a variety of 3D-printed hair clips that bring playful energy to any rave outfit. Each lightweight PLA charm sits on a spring attached to a metal alligator clip. Perfect for sharing with friends, trading at your next show, or gifting to the EDM lover in your life. Available in 11, 22 or 33 packs with bonus sprouts included.</w:t>
       </w:r>
     </w:p>
     <w:p>
@@ -753,7 +753,7 @@
           <w:sz w:val="21"/>
           <w:szCs w:val="21"/>
         </w:rPr>
-        <w:t xml:space="preserve">10, 20 or 30 assorted sprouts plus 1, 2 or 3 free, each packaged separately.</w:t>
+        <w:t xml:space="preserve">11, 22 or 33 assorted sprouts with bonus sprouts included, each packaged separately.</w:t>
       </w:r>
     </w:p>
     <w:p>

</xml_diff>